<commit_message>
Small improvements in exit questionnaire
</commit_message>
<xml_diff>
--- a/CourseMaterials/07_wrap_up/00_off_boarding/exit_questionaire.docx
+++ b/CourseMaterials/07_wrap_up/00_off_boarding/exit_questionaire.docx
@@ -7,62 +7,62 @@
         <w:pStyle w:val="Heading1"/>
         <w:rPr>
           <w:rFonts w:ascii="Garamond" w:hAnsi="Garamond"/>
-          <w:sz w:val="32"/>
-        </w:rPr>
-      </w:pPr>
-      <w:r>
-        <w:rPr>
-          <w:rFonts w:ascii="Garamond" w:hAnsi="Garamond"/>
-          <w:sz w:val="32"/>
+          <w:szCs w:val="28"/>
+        </w:rPr>
+      </w:pPr>
+      <w:r>
+        <w:rPr>
+          <w:rFonts w:ascii="Garamond" w:hAnsi="Garamond"/>
+          <w:szCs w:val="28"/>
         </w:rPr>
         <w:t>It Was</w:t>
       </w:r>
       <w:r>
         <w:rPr>
           <w:rFonts w:ascii="Garamond" w:hAnsi="Garamond"/>
-          <w:sz w:val="32"/>
+          <w:szCs w:val="28"/>
         </w:rPr>
         <w:t xml:space="preserve"> Nice</w:t>
       </w:r>
       <w:r>
         <w:rPr>
           <w:rFonts w:ascii="Garamond" w:hAnsi="Garamond"/>
-          <w:sz w:val="32"/>
-        </w:rPr>
-        <w:t xml:space="preserve"> to Meet You</w:t>
-      </w:r>
-      <w:r>
-        <w:rPr>
-          <w:rFonts w:ascii="Garamond" w:hAnsi="Garamond"/>
-          <w:sz w:val="32"/>
-        </w:rPr>
-        <w:t xml:space="preserve">!                                    </w:t>
-      </w:r>
-      <w:r>
-        <w:rPr>
-          <w:rFonts w:ascii="Garamond" w:hAnsi="Garamond"/>
           <w:szCs w:val="28"/>
         </w:rPr>
-        <w:t>Name</w:t>
-      </w:r>
-      <w:r>
-        <w:rPr>
-          <w:rFonts w:ascii="Garamond" w:hAnsi="Garamond"/>
-          <w:sz w:val="32"/>
-        </w:rPr>
-        <w:t>: __</w:t>
-      </w:r>
-      <w:r>
-        <w:rPr>
-          <w:rFonts w:ascii="Garamond" w:hAnsi="Garamond"/>
-          <w:sz w:val="32"/>
+        <w:t xml:space="preserve"> to Meet You!                     </w:t>
+      </w:r>
+      <w:r>
+        <w:rPr>
+          <w:rFonts w:ascii="Garamond" w:hAnsi="Garamond"/>
+          <w:szCs w:val="28"/>
+        </w:rPr>
+        <w:t xml:space="preserve">         </w:t>
+      </w:r>
+      <w:r>
+        <w:rPr>
+          <w:rFonts w:ascii="Garamond" w:hAnsi="Garamond"/>
+          <w:szCs w:val="28"/>
+        </w:rPr>
+        <w:t xml:space="preserve">               Name: __</w:t>
+      </w:r>
+      <w:r>
+        <w:rPr>
+          <w:rFonts w:ascii="Garamond" w:hAnsi="Garamond"/>
+          <w:szCs w:val="28"/>
+        </w:rPr>
+        <w:t>___</w:t>
+      </w:r>
+      <w:r>
+        <w:rPr>
+          <w:rFonts w:ascii="Garamond" w:hAnsi="Garamond"/>
+          <w:szCs w:val="28"/>
         </w:rPr>
         <w:t>_______</w:t>
       </w:r>
       <w:r>
         <w:rPr>
           <w:rFonts w:ascii="Garamond" w:hAnsi="Garamond"/>
-          <w:sz w:val="32"/>
+          <w:szCs w:val="28"/>
         </w:rPr>
         <w:t>____</w:t>
       </w:r>
@@ -79,7 +79,7 @@
         <w:pStyle w:val="ListParagraph"/>
         <w:numPr>
           <w:ilvl w:val="0"/>
-          <w:numId w:val="1"/>
+          <w:numId w:val="2"/>
         </w:numPr>
         <w:rPr>
           <w:rFonts w:ascii="Garamond" w:hAnsi="Garamond"/>
@@ -96,6 +96,12 @@
           <w:rFonts w:ascii="Garamond" w:hAnsi="Garamond"/>
         </w:rPr>
         <w:t>?</w:t>
+      </w:r>
+      <w:r>
+        <w:rPr>
+          <w:rFonts w:ascii="Garamond" w:hAnsi="Garamond"/>
+        </w:rPr>
+        <w:t xml:space="preserve"> Why?</w:t>
       </w:r>
     </w:p>
     <w:p>
@@ -145,7 +151,7 @@
         <w:pStyle w:val="ListParagraph"/>
         <w:numPr>
           <w:ilvl w:val="0"/>
-          <w:numId w:val="1"/>
+          <w:numId w:val="2"/>
         </w:numPr>
         <w:rPr>
           <w:rFonts w:ascii="Garamond" w:hAnsi="Garamond"/>
@@ -162,6 +168,12 @@
           <w:rFonts w:ascii="Garamond" w:hAnsi="Garamond"/>
         </w:rPr>
         <w:t>?</w:t>
+      </w:r>
+      <w:r>
+        <w:rPr>
+          <w:rFonts w:ascii="Garamond" w:hAnsi="Garamond"/>
+        </w:rPr>
+        <w:t xml:space="preserve"> Why?</w:t>
       </w:r>
     </w:p>
     <w:p>
@@ -211,7 +223,7 @@
         <w:pStyle w:val="ListParagraph"/>
         <w:numPr>
           <w:ilvl w:val="0"/>
-          <w:numId w:val="1"/>
+          <w:numId w:val="2"/>
         </w:numPr>
         <w:rPr>
           <w:rFonts w:ascii="Garamond" w:hAnsi="Garamond"/>
@@ -277,7 +289,7 @@
         <w:pStyle w:val="ListParagraph"/>
         <w:numPr>
           <w:ilvl w:val="0"/>
-          <w:numId w:val="1"/>
+          <w:numId w:val="2"/>
         </w:numPr>
         <w:rPr>
           <w:rFonts w:ascii="Garamond" w:hAnsi="Garamond"/>
@@ -337,7 +349,7 @@
         <w:pStyle w:val="ListParagraph"/>
         <w:numPr>
           <w:ilvl w:val="0"/>
-          <w:numId w:val="1"/>
+          <w:numId w:val="2"/>
         </w:numPr>
         <w:rPr>
           <w:rFonts w:ascii="Garamond" w:hAnsi="Garamond"/>
@@ -365,13 +377,19 @@
         <w:rPr>
           <w:rFonts w:ascii="Garamond" w:hAnsi="Garamond"/>
         </w:rPr>
+        <w:t>,</w:t>
+      </w:r>
+      <w:r>
+        <w:rPr>
+          <w:rFonts w:ascii="Garamond" w:hAnsi="Garamond"/>
+        </w:rPr>
         <w:t>”</w:t>
       </w:r>
       <w:r>
         <w:rPr>
           <w:rFonts w:ascii="Garamond" w:hAnsi="Garamond"/>
         </w:rPr>
-        <w:t>, what will you say</w:t>
+        <w:t xml:space="preserve"> what will you say</w:t>
       </w:r>
       <w:r>
         <w:rPr>
@@ -427,7 +445,7 @@
         <w:pStyle w:val="ListParagraph"/>
         <w:numPr>
           <w:ilvl w:val="0"/>
-          <w:numId w:val="1"/>
+          <w:numId w:val="2"/>
         </w:numPr>
         <w:rPr>
           <w:rFonts w:ascii="Garamond" w:hAnsi="Garamond"/>
@@ -529,7 +547,7 @@
         <w:pStyle w:val="ListParagraph"/>
         <w:numPr>
           <w:ilvl w:val="0"/>
-          <w:numId w:val="1"/>
+          <w:numId w:val="2"/>
         </w:numPr>
         <w:rPr>
           <w:rFonts w:ascii="Garamond" w:hAnsi="Garamond"/>
@@ -597,7 +615,7 @@
         <w:pStyle w:val="ListParagraph"/>
         <w:numPr>
           <w:ilvl w:val="0"/>
-          <w:numId w:val="1"/>
+          <w:numId w:val="2"/>
         </w:numPr>
         <w:rPr>
           <w:rFonts w:ascii="Garamond" w:hAnsi="Garamond"/>
@@ -635,7 +653,7 @@
         <w:pStyle w:val="ListParagraph"/>
         <w:numPr>
           <w:ilvl w:val="1"/>
-          <w:numId w:val="1"/>
+          <w:numId w:val="2"/>
         </w:numPr>
         <w:rPr>
           <w:rFonts w:ascii="Garamond" w:hAnsi="Garamond"/>
@@ -645,13 +663,7 @@
         <w:rPr>
           <w:rFonts w:ascii="Garamond" w:hAnsi="Garamond"/>
         </w:rPr>
-        <w:t xml:space="preserve">My teacher was prepared for class: </w:t>
-      </w:r>
-      <w:r>
-        <w:rPr>
-          <w:rFonts w:ascii="Garamond" w:hAnsi="Garamond"/>
-        </w:rPr>
-        <w:t>___</w:t>
+        <w:t>My teacher was prepared for class: ___</w:t>
       </w:r>
     </w:p>
     <w:p>
@@ -667,7 +679,7 @@
         <w:pStyle w:val="ListParagraph"/>
         <w:numPr>
           <w:ilvl w:val="1"/>
-          <w:numId w:val="1"/>
+          <w:numId w:val="2"/>
         </w:numPr>
         <w:rPr>
           <w:rFonts w:ascii="Garamond" w:hAnsi="Garamond"/>
@@ -695,13 +707,7 @@
         <w:rPr>
           <w:rFonts w:ascii="Garamond" w:hAnsi="Garamond"/>
         </w:rPr>
-        <w:t xml:space="preserve"> helped me understand the material: </w:t>
-      </w:r>
-      <w:r>
-        <w:rPr>
-          <w:rFonts w:ascii="Garamond" w:hAnsi="Garamond"/>
-        </w:rPr>
-        <w:t>___</w:t>
+        <w:t xml:space="preserve"> helped me understand the material: ___</w:t>
       </w:r>
     </w:p>
     <w:p>
@@ -716,7 +722,7 @@
         <w:pStyle w:val="ListParagraph"/>
         <w:numPr>
           <w:ilvl w:val="1"/>
-          <w:numId w:val="1"/>
+          <w:numId w:val="2"/>
         </w:numPr>
         <w:rPr>
           <w:rFonts w:ascii="Garamond" w:hAnsi="Garamond"/>
@@ -777,7 +783,7 @@
         <w:pStyle w:val="ListParagraph"/>
         <w:numPr>
           <w:ilvl w:val="1"/>
-          <w:numId w:val="1"/>
+          <w:numId w:val="2"/>
         </w:numPr>
         <w:rPr>
           <w:rFonts w:ascii="Garamond" w:hAnsi="Garamond"/>
@@ -787,13 +793,7 @@
         <w:rPr>
           <w:rFonts w:ascii="Garamond" w:hAnsi="Garamond"/>
         </w:rPr>
-        <w:t xml:space="preserve">The homework helped me understand the material: </w:t>
-      </w:r>
-      <w:r>
-        <w:rPr>
-          <w:rFonts w:ascii="Garamond" w:hAnsi="Garamond"/>
-        </w:rPr>
-        <w:t>___</w:t>
+        <w:t>The homework helped me understand the material: ___</w:t>
       </w:r>
     </w:p>
     <w:p>
@@ -808,7 +808,7 @@
         <w:pStyle w:val="ListParagraph"/>
         <w:numPr>
           <w:ilvl w:val="1"/>
-          <w:numId w:val="1"/>
+          <w:numId w:val="2"/>
         </w:numPr>
         <w:rPr>
           <w:rFonts w:ascii="Garamond" w:hAnsi="Garamond"/>
@@ -833,7 +833,7 @@
         <w:pStyle w:val="ListParagraph"/>
         <w:numPr>
           <w:ilvl w:val="1"/>
-          <w:numId w:val="1"/>
+          <w:numId w:val="2"/>
         </w:numPr>
         <w:rPr>
           <w:rFonts w:ascii="Garamond" w:hAnsi="Garamond"/>
@@ -843,13 +843,7 @@
         <w:rPr>
           <w:rFonts w:ascii="Garamond" w:hAnsi="Garamond"/>
         </w:rPr>
-        <w:t xml:space="preserve">There was a good mixture of working individually and in groups: </w:t>
-      </w:r>
-      <w:r>
-        <w:rPr>
-          <w:rFonts w:ascii="Garamond" w:hAnsi="Garamond"/>
-        </w:rPr>
-        <w:t>___</w:t>
+        <w:t>There was a good mixture of working individually and in groups: ___</w:t>
       </w:r>
     </w:p>
     <w:p>
@@ -864,7 +858,7 @@
         <w:pStyle w:val="ListParagraph"/>
         <w:numPr>
           <w:ilvl w:val="1"/>
-          <w:numId w:val="1"/>
+          <w:numId w:val="2"/>
         </w:numPr>
         <w:rPr>
           <w:rFonts w:ascii="Garamond" w:hAnsi="Garamond"/>
@@ -896,7 +890,7 @@
         <w:pStyle w:val="ListParagraph"/>
         <w:numPr>
           <w:ilvl w:val="0"/>
-          <w:numId w:val="1"/>
+          <w:numId w:val="2"/>
         </w:numPr>
         <w:rPr>
           <w:rFonts w:ascii="Garamond" w:hAnsi="Garamond"/>
@@ -987,7 +981,7 @@
         <w:pStyle w:val="ListParagraph"/>
         <w:numPr>
           <w:ilvl w:val="0"/>
-          <w:numId w:val="1"/>
+          <w:numId w:val="2"/>
         </w:numPr>
         <w:rPr>
           <w:rFonts w:ascii="Garamond" w:hAnsi="Garamond"/>
@@ -1054,7 +1048,7 @@
         <w:pStyle w:val="ListParagraph"/>
         <w:numPr>
           <w:ilvl w:val="0"/>
-          <w:numId w:val="1"/>
+          <w:numId w:val="2"/>
         </w:numPr>
         <w:rPr>
           <w:rFonts w:ascii="Garamond" w:hAnsi="Garamond"/>
@@ -1180,8 +1174,100 @@
       </w:pPr>
     </w:lvl>
   </w:abstractNum>
+  <w:abstractNum w:abstractNumId="1" w15:restartNumberingAfterBreak="0">
+    <w:nsid w:val="7CBB685E"/>
+    <w:multiLevelType w:val="hybridMultilevel"/>
+    <w:tmpl w:val="EE3AA720"/>
+    <w:lvl w:ilvl="0" w:tplc="0409000F">
+      <w:start w:val="1"/>
+      <w:numFmt w:val="decimal"/>
+      <w:lvlText w:val="%1."/>
+      <w:lvlJc w:val="left"/>
+      <w:pPr>
+        <w:ind w:left="720" w:hanging="360"/>
+      </w:pPr>
+      <w:rPr>
+        <w:rFonts w:hint="default"/>
+      </w:rPr>
+    </w:lvl>
+    <w:lvl w:ilvl="1" w:tplc="04090019">
+      <w:start w:val="1"/>
+      <w:numFmt w:val="lowerLetter"/>
+      <w:lvlText w:val="%2."/>
+      <w:lvlJc w:val="left"/>
+      <w:pPr>
+        <w:ind w:left="1440" w:hanging="360"/>
+      </w:pPr>
+    </w:lvl>
+    <w:lvl w:ilvl="2" w:tplc="0409001B" w:tentative="1">
+      <w:start w:val="1"/>
+      <w:numFmt w:val="lowerRoman"/>
+      <w:lvlText w:val="%3."/>
+      <w:lvlJc w:val="right"/>
+      <w:pPr>
+        <w:ind w:left="2160" w:hanging="180"/>
+      </w:pPr>
+    </w:lvl>
+    <w:lvl w:ilvl="3" w:tplc="0409000F" w:tentative="1">
+      <w:start w:val="1"/>
+      <w:numFmt w:val="decimal"/>
+      <w:lvlText w:val="%4."/>
+      <w:lvlJc w:val="left"/>
+      <w:pPr>
+        <w:ind w:left="2880" w:hanging="360"/>
+      </w:pPr>
+    </w:lvl>
+    <w:lvl w:ilvl="4" w:tplc="04090019" w:tentative="1">
+      <w:start w:val="1"/>
+      <w:numFmt w:val="lowerLetter"/>
+      <w:lvlText w:val="%5."/>
+      <w:lvlJc w:val="left"/>
+      <w:pPr>
+        <w:ind w:left="3600" w:hanging="360"/>
+      </w:pPr>
+    </w:lvl>
+    <w:lvl w:ilvl="5" w:tplc="0409001B" w:tentative="1">
+      <w:start w:val="1"/>
+      <w:numFmt w:val="lowerRoman"/>
+      <w:lvlText w:val="%6."/>
+      <w:lvlJc w:val="right"/>
+      <w:pPr>
+        <w:ind w:left="4320" w:hanging="180"/>
+      </w:pPr>
+    </w:lvl>
+    <w:lvl w:ilvl="6" w:tplc="0409000F" w:tentative="1">
+      <w:start w:val="1"/>
+      <w:numFmt w:val="decimal"/>
+      <w:lvlText w:val="%7."/>
+      <w:lvlJc w:val="left"/>
+      <w:pPr>
+        <w:ind w:left="5040" w:hanging="360"/>
+      </w:pPr>
+    </w:lvl>
+    <w:lvl w:ilvl="7" w:tplc="04090019" w:tentative="1">
+      <w:start w:val="1"/>
+      <w:numFmt w:val="lowerLetter"/>
+      <w:lvlText w:val="%8."/>
+      <w:lvlJc w:val="left"/>
+      <w:pPr>
+        <w:ind w:left="5760" w:hanging="360"/>
+      </w:pPr>
+    </w:lvl>
+    <w:lvl w:ilvl="8" w:tplc="0409001B" w:tentative="1">
+      <w:start w:val="1"/>
+      <w:numFmt w:val="lowerRoman"/>
+      <w:lvlText w:val="%9."/>
+      <w:lvlJc w:val="right"/>
+      <w:pPr>
+        <w:ind w:left="6480" w:hanging="180"/>
+      </w:pPr>
+    </w:lvl>
+  </w:abstractNum>
   <w:num w:numId="1" w16cid:durableId="849565987">
     <w:abstractNumId w:val="0"/>
+  </w:num>
+  <w:num w:numId="2" w16cid:durableId="652492760">
+    <w:abstractNumId w:val="1"/>
   </w:num>
 </w:numbering>
 </file>

</xml_diff>